<commit_message>
Subo modificaciones a mi rama, modificaciones a la documentación en cuanto a su formato y explicación
</commit_message>
<xml_diff>
--- a/Javier_Carpeta_de_evidencias/ejercicio_permisos/Documentacion_Javier.docx
+++ b/Javier_Carpeta_de_evidencias/ejercicio_permisos/Documentacion_Javier.docx
@@ -4,6 +4,7 @@
   <w:body>
     <w:p>
       <w:pPr>
+        <w:jc w:val="both"/>
         <w:rPr>
           <w:sz w:val="36"/>
           <w:szCs w:val="36"/>
@@ -19,11 +20,358 @@
     </w:p>
     <w:p>
       <w:pPr>
+        <w:jc w:val="both"/>
+        <w:rPr>
+          <w:sz w:val="24"/>
+          <w:szCs w:val="24"/>
+        </w:rPr>
+      </w:pPr>
+      <w:r>
+        <w:rPr>
+          <w:sz w:val="24"/>
+          <w:szCs w:val="24"/>
+        </w:rPr>
+        <w:t>Como primeros pasos creamos la nueva Branch “</w:t>
+      </w:r>
+      <w:proofErr w:type="spellStart"/>
+      <w:r>
+        <w:rPr>
+          <w:sz w:val="24"/>
+          <w:szCs w:val="24"/>
+        </w:rPr>
+        <w:t>Javier_Carpeta_de_evidencias</w:t>
+      </w:r>
+      <w:proofErr w:type="spellEnd"/>
+      <w:r>
+        <w:rPr>
+          <w:sz w:val="24"/>
+          <w:szCs w:val="24"/>
+        </w:rPr>
+        <w:t xml:space="preserve">”, a </w:t>
+      </w:r>
+      <w:proofErr w:type="gramStart"/>
+      <w:r>
+        <w:rPr>
+          <w:sz w:val="24"/>
+          <w:szCs w:val="24"/>
+        </w:rPr>
+        <w:t>continuación</w:t>
+      </w:r>
+      <w:proofErr w:type="gramEnd"/>
+      <w:r>
+        <w:rPr>
+          <w:sz w:val="24"/>
+          <w:szCs w:val="24"/>
+        </w:rPr>
+        <w:t xml:space="preserve"> la nueva carpeta “</w:t>
+      </w:r>
+      <w:proofErr w:type="spellStart"/>
+      <w:r>
+        <w:rPr>
+          <w:sz w:val="24"/>
+          <w:szCs w:val="24"/>
+        </w:rPr>
+        <w:t>Javier_Carpeta_de_evidencias</w:t>
+      </w:r>
+      <w:proofErr w:type="spellEnd"/>
+      <w:r>
+        <w:rPr>
+          <w:sz w:val="24"/>
+          <w:szCs w:val="24"/>
+        </w:rPr>
+        <w:t>”, dentro de esta nueva carpeta creamos otra carpeta llamada “</w:t>
+      </w:r>
+      <w:proofErr w:type="spellStart"/>
+      <w:r>
+        <w:rPr>
+          <w:sz w:val="24"/>
+          <w:szCs w:val="24"/>
+        </w:rPr>
+        <w:t>ejercicio_permisos</w:t>
+      </w:r>
+      <w:proofErr w:type="spellEnd"/>
+      <w:r>
+        <w:rPr>
+          <w:sz w:val="24"/>
+          <w:szCs w:val="24"/>
+        </w:rPr>
+        <w:t>”, y dentro de ella agregamos la documentación que creamos con los compañeros del equipo.</w:t>
+      </w:r>
+    </w:p>
+    <w:p>
+      <w:pPr>
+        <w:jc w:val="both"/>
         <w:rPr>
           <w:sz w:val="36"/>
           <w:szCs w:val="36"/>
         </w:rPr>
       </w:pPr>
+      <w:r>
+        <w:rPr>
+          <w:sz w:val="36"/>
+          <w:szCs w:val="36"/>
+        </w:rPr>
+        <w:drawing>
+          <wp:inline distT="0" distB="0" distL="0" distR="0" wp14:anchorId="3F9FB734" wp14:editId="03518712">
+            <wp:extent cx="5733415" cy="3614420"/>
+            <wp:effectExtent l="0" t="0" r="635" b="5080"/>
+            <wp:docPr id="950661742" name="Imagen 1"/>
+            <wp:cNvGraphicFramePr>
+              <a:graphicFrameLocks xmlns:a="http://schemas.openxmlformats.org/drawingml/2006/main" noChangeAspect="1"/>
+            </wp:cNvGraphicFramePr>
+            <a:graphic xmlns:a="http://schemas.openxmlformats.org/drawingml/2006/main">
+              <a:graphicData uri="http://schemas.openxmlformats.org/drawingml/2006/picture">
+                <pic:pic xmlns:pic="http://schemas.openxmlformats.org/drawingml/2006/picture">
+                  <pic:nvPicPr>
+                    <pic:cNvPr id="950661742" name=""/>
+                    <pic:cNvPicPr/>
+                  </pic:nvPicPr>
+                  <pic:blipFill>
+                    <a:blip r:embed="rId5"/>
+                    <a:stretch>
+                      <a:fillRect/>
+                    </a:stretch>
+                  </pic:blipFill>
+                  <pic:spPr>
+                    <a:xfrm>
+                      <a:off x="0" y="0"/>
+                      <a:ext cx="5733415" cy="3614420"/>
+                    </a:xfrm>
+                    <a:prstGeom prst="rect">
+                      <a:avLst/>
+                    </a:prstGeom>
+                  </pic:spPr>
+                </pic:pic>
+              </a:graphicData>
+            </a:graphic>
+          </wp:inline>
+        </w:drawing>
+      </w:r>
+    </w:p>
+    <w:p>
+      <w:pPr>
+        <w:jc w:val="both"/>
+        <w:rPr>
+          <w:i/>
+          <w:iCs/>
+          <w:sz w:val="24"/>
+          <w:szCs w:val="24"/>
+        </w:rPr>
+      </w:pPr>
+      <w:r>
+        <w:rPr>
+          <w:i/>
+          <w:iCs/>
+          <w:sz w:val="24"/>
+          <w:szCs w:val="24"/>
+        </w:rPr>
+        <w:t xml:space="preserve">Imagen 1. Comandos usados tanto para la creación de la </w:t>
+      </w:r>
+      <w:proofErr w:type="gramStart"/>
+      <w:r>
+        <w:rPr>
+          <w:i/>
+          <w:iCs/>
+          <w:sz w:val="24"/>
+          <w:szCs w:val="24"/>
+        </w:rPr>
+        <w:t>rama ,</w:t>
+      </w:r>
+      <w:proofErr w:type="gramEnd"/>
+      <w:r>
+        <w:rPr>
+          <w:i/>
+          <w:iCs/>
+          <w:sz w:val="24"/>
+          <w:szCs w:val="24"/>
+        </w:rPr>
+        <w:t xml:space="preserve"> como cambio de </w:t>
+      </w:r>
+      <w:proofErr w:type="gramStart"/>
+      <w:r>
+        <w:rPr>
+          <w:i/>
+          <w:iCs/>
+          <w:sz w:val="24"/>
+          <w:szCs w:val="24"/>
+        </w:rPr>
+        <w:t>dirección</w:t>
+      </w:r>
+      <w:proofErr w:type="gramEnd"/>
+      <w:r>
+        <w:rPr>
+          <w:i/>
+          <w:iCs/>
+          <w:sz w:val="24"/>
+          <w:szCs w:val="24"/>
+        </w:rPr>
+        <w:t xml:space="preserve"> así como creación de las carpetas.</w:t>
+      </w:r>
+    </w:p>
+    <w:p>
+      <w:pPr>
+        <w:jc w:val="both"/>
+        <w:rPr>
+          <w:sz w:val="36"/>
+          <w:szCs w:val="36"/>
+        </w:rPr>
+      </w:pPr>
+      <w:r>
+        <w:rPr>
+          <w:sz w:val="36"/>
+          <w:szCs w:val="36"/>
+        </w:rPr>
+        <w:drawing>
+          <wp:inline distT="0" distB="0" distL="0" distR="0" wp14:anchorId="19FBAAFB" wp14:editId="203F38B0">
+            <wp:extent cx="5733415" cy="3055620"/>
+            <wp:effectExtent l="0" t="0" r="635" b="0"/>
+            <wp:docPr id="1009465637" name="Imagen 1"/>
+            <wp:cNvGraphicFramePr>
+              <a:graphicFrameLocks xmlns:a="http://schemas.openxmlformats.org/drawingml/2006/main" noChangeAspect="1"/>
+            </wp:cNvGraphicFramePr>
+            <a:graphic xmlns:a="http://schemas.openxmlformats.org/drawingml/2006/main">
+              <a:graphicData uri="http://schemas.openxmlformats.org/drawingml/2006/picture">
+                <pic:pic xmlns:pic="http://schemas.openxmlformats.org/drawingml/2006/picture">
+                  <pic:nvPicPr>
+                    <pic:cNvPr id="1009465637" name=""/>
+                    <pic:cNvPicPr/>
+                  </pic:nvPicPr>
+                  <pic:blipFill>
+                    <a:blip r:embed="rId6"/>
+                    <a:stretch>
+                      <a:fillRect/>
+                    </a:stretch>
+                  </pic:blipFill>
+                  <pic:spPr>
+                    <a:xfrm>
+                      <a:off x="0" y="0"/>
+                      <a:ext cx="5733415" cy="3055620"/>
+                    </a:xfrm>
+                    <a:prstGeom prst="rect">
+                      <a:avLst/>
+                    </a:prstGeom>
+                  </pic:spPr>
+                </pic:pic>
+              </a:graphicData>
+            </a:graphic>
+          </wp:inline>
+        </w:drawing>
+      </w:r>
+    </w:p>
+    <w:p>
+      <w:pPr>
+        <w:jc w:val="both"/>
+        <w:rPr>
+          <w:i/>
+          <w:iCs/>
+          <w:sz w:val="24"/>
+          <w:szCs w:val="24"/>
+        </w:rPr>
+      </w:pPr>
+      <w:r>
+        <w:rPr>
+          <w:i/>
+          <w:iCs/>
+          <w:sz w:val="24"/>
+          <w:szCs w:val="24"/>
+        </w:rPr>
+        <w:t xml:space="preserve">Imagen </w:t>
+      </w:r>
+      <w:r>
+        <w:rPr>
+          <w:i/>
+          <w:iCs/>
+          <w:sz w:val="24"/>
+          <w:szCs w:val="24"/>
+        </w:rPr>
+        <w:t>2</w:t>
+      </w:r>
+      <w:r>
+        <w:rPr>
+          <w:i/>
+          <w:iCs/>
+          <w:sz w:val="24"/>
+          <w:szCs w:val="24"/>
+        </w:rPr>
+        <w:t xml:space="preserve">. Comandos usados tanto </w:t>
+      </w:r>
+      <w:r>
+        <w:rPr>
+          <w:i/>
+          <w:iCs/>
+          <w:sz w:val="24"/>
+          <w:szCs w:val="24"/>
+        </w:rPr>
+        <w:t xml:space="preserve">para crear el </w:t>
+      </w:r>
+      <w:proofErr w:type="spellStart"/>
+      <w:r>
+        <w:rPr>
+          <w:i/>
+          <w:iCs/>
+          <w:sz w:val="24"/>
+          <w:szCs w:val="24"/>
+        </w:rPr>
+        <w:t>commit</w:t>
+      </w:r>
+      <w:proofErr w:type="spellEnd"/>
+      <w:r>
+        <w:rPr>
+          <w:i/>
+          <w:iCs/>
+          <w:sz w:val="24"/>
+          <w:szCs w:val="24"/>
+        </w:rPr>
+        <w:t xml:space="preserve"> como para subir la rama y los cambios respectivos.</w:t>
+      </w:r>
+    </w:p>
+    <w:p>
+      <w:pPr>
+        <w:jc w:val="both"/>
+        <w:rPr>
+          <w:sz w:val="36"/>
+          <w:szCs w:val="36"/>
+        </w:rPr>
+      </w:pPr>
+    </w:p>
+    <w:p>
+      <w:pPr>
+        <w:jc w:val="both"/>
+        <w:rPr>
+          <w:sz w:val="24"/>
+          <w:szCs w:val="24"/>
+        </w:rPr>
+      </w:pPr>
+      <w:r>
+        <w:rPr>
+          <w:sz w:val="24"/>
+          <w:szCs w:val="24"/>
+        </w:rPr>
+        <w:t xml:space="preserve">Para la realización de este ejercicio se buscaba aprender como modificar los permisos de un usuario. Por lo que se optó por inicialmente empezar creando una carpeta que no tenga permisos para ver </w:t>
+      </w:r>
+      <w:proofErr w:type="spellStart"/>
+      <w:r>
+        <w:rPr>
+          <w:sz w:val="24"/>
+          <w:szCs w:val="24"/>
+        </w:rPr>
+        <w:t>que</w:t>
+      </w:r>
+      <w:proofErr w:type="spellEnd"/>
+      <w:r>
+        <w:rPr>
+          <w:sz w:val="24"/>
+          <w:szCs w:val="24"/>
+        </w:rPr>
+        <w:t xml:space="preserve"> características tienen y así consecuentemente cambiar</w:t>
+      </w:r>
+      <w:r>
+        <w:rPr>
+          <w:sz w:val="24"/>
+          <w:szCs w:val="24"/>
+        </w:rPr>
+        <w:t>los otorgándole los permisos al usuario.</w:t>
+      </w:r>
     </w:p>
     <w:p>
       <w:pPr>
@@ -31,6 +379,7 @@
           <w:ilvl w:val="0"/>
           <w:numId w:val="1"/>
         </w:numPr>
+        <w:jc w:val="both"/>
         <w:rPr>
           <w:sz w:val="24"/>
           <w:szCs w:val="24"/>
@@ -46,14 +395,16 @@
     </w:p>
     <w:p>
       <w:pPr>
-        <w:rPr>
-          <w:sz w:val="24"/>
-          <w:szCs w:val="24"/>
-        </w:rPr>
-      </w:pPr>
-    </w:p>
-    <w:p>
-      <w:pPr>
+        <w:jc w:val="both"/>
+        <w:rPr>
+          <w:sz w:val="24"/>
+          <w:szCs w:val="24"/>
+        </w:rPr>
+      </w:pPr>
+    </w:p>
+    <w:p>
+      <w:pPr>
+        <w:jc w:val="both"/>
         <w:rPr>
           <w:sz w:val="24"/>
           <w:szCs w:val="24"/>
@@ -79,7 +430,7 @@
                     <pic:cNvPicPr preferRelativeResize="0"/>
                   </pic:nvPicPr>
                   <pic:blipFill>
-                    <a:blip r:embed="rId5"/>
+                    <a:blip r:embed="rId7"/>
                     <a:srcRect/>
                     <a:stretch>
                       <a:fillRect/>
@@ -104,53 +455,95 @@
     </w:p>
     <w:p>
       <w:pPr>
-        <w:rPr>
-          <w:sz w:val="24"/>
-          <w:szCs w:val="24"/>
-        </w:rPr>
-      </w:pPr>
-    </w:p>
-    <w:p>
-      <w:pPr>
-        <w:numPr>
-          <w:ilvl w:val="0"/>
-          <w:numId w:val="2"/>
-        </w:numPr>
-        <w:rPr>
-          <w:sz w:val="24"/>
-          <w:szCs w:val="24"/>
-        </w:rPr>
-      </w:pPr>
-      <w:r>
-        <w:rPr>
-          <w:sz w:val="24"/>
-          <w:szCs w:val="24"/>
-        </w:rPr>
-        <w:t xml:space="preserve">Estos son los comandos que utilicé para el desarrollo del ejercicio, afortunadamente no hubo </w:t>
-      </w:r>
-      <w:proofErr w:type="gramStart"/>
-      <w:r>
-        <w:rPr>
-          <w:sz w:val="24"/>
-          <w:szCs w:val="24"/>
-        </w:rPr>
-        <w:t>errores</w:t>
-      </w:r>
-      <w:proofErr w:type="gramEnd"/>
-      <w:r>
-        <w:rPr>
-          <w:sz w:val="24"/>
-          <w:szCs w:val="24"/>
-        </w:rPr>
-        <w:t xml:space="preserve"> pero se me olvidó documentar paso por paso</w:t>
-      </w:r>
-    </w:p>
-    <w:p>
-      <w:pPr>
-        <w:numPr>
-          <w:ilvl w:val="0"/>
-          <w:numId w:val="2"/>
-        </w:numPr>
+        <w:jc w:val="both"/>
+        <w:rPr>
+          <w:i/>
+          <w:iCs/>
+          <w:sz w:val="24"/>
+          <w:szCs w:val="24"/>
+        </w:rPr>
+      </w:pPr>
+      <w:r>
+        <w:rPr>
+          <w:i/>
+          <w:iCs/>
+          <w:sz w:val="24"/>
+          <w:szCs w:val="24"/>
+        </w:rPr>
+        <w:t xml:space="preserve">Imagen </w:t>
+      </w:r>
+      <w:r>
+        <w:rPr>
+          <w:i/>
+          <w:iCs/>
+          <w:sz w:val="24"/>
+          <w:szCs w:val="24"/>
+        </w:rPr>
+        <w:t>3</w:t>
+      </w:r>
+      <w:r>
+        <w:rPr>
+          <w:i/>
+          <w:iCs/>
+          <w:sz w:val="24"/>
+          <w:szCs w:val="24"/>
+        </w:rPr>
+        <w:t xml:space="preserve">. </w:t>
+      </w:r>
+      <w:r>
+        <w:rPr>
+          <w:i/>
+          <w:iCs/>
+          <w:sz w:val="24"/>
+          <w:szCs w:val="24"/>
+        </w:rPr>
+        <w:t>Evidencia del compañero de equipo Alejandro para crear su rama.</w:t>
+      </w:r>
+    </w:p>
+    <w:p>
+      <w:pPr>
+        <w:jc w:val="both"/>
+        <w:rPr>
+          <w:sz w:val="24"/>
+          <w:szCs w:val="24"/>
+        </w:rPr>
+      </w:pPr>
+    </w:p>
+    <w:p>
+      <w:pPr>
+        <w:jc w:val="both"/>
+        <w:rPr>
+          <w:sz w:val="24"/>
+          <w:szCs w:val="24"/>
+        </w:rPr>
+      </w:pPr>
+      <w:r>
+        <w:rPr>
+          <w:sz w:val="24"/>
+          <w:szCs w:val="24"/>
+        </w:rPr>
+        <w:t xml:space="preserve">Abrimos </w:t>
+      </w:r>
+      <w:proofErr w:type="spellStart"/>
+      <w:r>
+        <w:rPr>
+          <w:sz w:val="24"/>
+          <w:szCs w:val="24"/>
+        </w:rPr>
+        <w:t>wsl</w:t>
+      </w:r>
+      <w:proofErr w:type="spellEnd"/>
+      <w:r>
+        <w:rPr>
+          <w:sz w:val="24"/>
+          <w:szCs w:val="24"/>
+        </w:rPr>
+        <w:t>, y creamos la dirección y cambiamos a ella</w:t>
+      </w:r>
+    </w:p>
+    <w:p>
+      <w:pPr>
+        <w:jc w:val="both"/>
         <w:rPr>
           <w:sz w:val="24"/>
           <w:szCs w:val="24"/>
@@ -176,7 +569,7 @@
                     <pic:cNvPicPr preferRelativeResize="0"/>
                   </pic:nvPicPr>
                   <pic:blipFill>
-                    <a:blip r:embed="rId6"/>
+                    <a:blip r:embed="rId8"/>
                     <a:srcRect/>
                     <a:stretch>
                       <a:fillRect/>
@@ -201,15 +594,165 @@
     </w:p>
     <w:p>
       <w:pPr>
-        <w:numPr>
-          <w:ilvl w:val="0"/>
-          <w:numId w:val="2"/>
-        </w:numPr>
-        <w:rPr>
-          <w:sz w:val="24"/>
-          <w:szCs w:val="24"/>
-        </w:rPr>
-      </w:pPr>
+        <w:jc w:val="both"/>
+        <w:rPr>
+          <w:i/>
+          <w:iCs/>
+          <w:sz w:val="24"/>
+          <w:szCs w:val="24"/>
+        </w:rPr>
+      </w:pPr>
+      <w:r>
+        <w:rPr>
+          <w:i/>
+          <w:iCs/>
+          <w:sz w:val="24"/>
+          <w:szCs w:val="24"/>
+        </w:rPr>
+        <w:t xml:space="preserve">Imagen </w:t>
+      </w:r>
+      <w:r>
+        <w:rPr>
+          <w:i/>
+          <w:iCs/>
+          <w:sz w:val="24"/>
+          <w:szCs w:val="24"/>
+        </w:rPr>
+        <w:t>4</w:t>
+      </w:r>
+      <w:r>
+        <w:rPr>
+          <w:i/>
+          <w:iCs/>
+          <w:sz w:val="24"/>
+          <w:szCs w:val="24"/>
+        </w:rPr>
+        <w:t xml:space="preserve">. Evidencia del compañero de equipo Alejandro </w:t>
+      </w:r>
+      <w:r>
+        <w:rPr>
+          <w:i/>
+          <w:iCs/>
+          <w:sz w:val="24"/>
+          <w:szCs w:val="24"/>
+        </w:rPr>
+        <w:t xml:space="preserve">al usar </w:t>
+      </w:r>
+      <w:proofErr w:type="spellStart"/>
+      <w:r>
+        <w:rPr>
+          <w:i/>
+          <w:iCs/>
+          <w:sz w:val="24"/>
+          <w:szCs w:val="24"/>
+        </w:rPr>
+        <w:t>wsl</w:t>
+      </w:r>
+      <w:proofErr w:type="spellEnd"/>
+      <w:r>
+        <w:rPr>
+          <w:i/>
+          <w:iCs/>
+          <w:sz w:val="24"/>
+          <w:szCs w:val="24"/>
+        </w:rPr>
+        <w:t>, crear una dirección y cambio de dirección a ella.</w:t>
+      </w:r>
+    </w:p>
+    <w:p>
+      <w:pPr>
+        <w:jc w:val="both"/>
+        <w:rPr>
+          <w:sz w:val="24"/>
+          <w:szCs w:val="24"/>
+        </w:rPr>
+      </w:pPr>
+    </w:p>
+    <w:p>
+      <w:pPr>
+        <w:jc w:val="both"/>
+        <w:rPr>
+          <w:sz w:val="24"/>
+          <w:szCs w:val="24"/>
+        </w:rPr>
+      </w:pPr>
+    </w:p>
+    <w:p>
+      <w:pPr>
+        <w:jc w:val="both"/>
+        <w:rPr>
+          <w:sz w:val="24"/>
+          <w:szCs w:val="24"/>
+        </w:rPr>
+      </w:pPr>
+    </w:p>
+    <w:p>
+      <w:pPr>
+        <w:jc w:val="both"/>
+        <w:rPr>
+          <w:sz w:val="24"/>
+          <w:szCs w:val="24"/>
+        </w:rPr>
+      </w:pPr>
+    </w:p>
+    <w:p>
+      <w:pPr>
+        <w:jc w:val="both"/>
+        <w:rPr>
+          <w:sz w:val="24"/>
+          <w:szCs w:val="24"/>
+        </w:rPr>
+      </w:pPr>
+    </w:p>
+    <w:p>
+      <w:pPr>
+        <w:jc w:val="both"/>
+        <w:rPr>
+          <w:sz w:val="24"/>
+          <w:szCs w:val="24"/>
+        </w:rPr>
+      </w:pPr>
+    </w:p>
+    <w:p>
+      <w:pPr>
+        <w:jc w:val="both"/>
+        <w:rPr>
+          <w:sz w:val="24"/>
+          <w:szCs w:val="24"/>
+        </w:rPr>
+      </w:pPr>
+    </w:p>
+    <w:p>
+      <w:pPr>
+        <w:rPr>
+          <w:sz w:val="24"/>
+          <w:szCs w:val="24"/>
+        </w:rPr>
+      </w:pPr>
+      <w:r>
+        <w:rPr>
+          <w:sz w:val="24"/>
+          <w:szCs w:val="24"/>
+        </w:rPr>
+        <w:lastRenderedPageBreak/>
+        <w:t xml:space="preserve">En esta captura el compañero Alejandro cambio los permisos para quitárselos. </w:t>
+      </w:r>
+      <w:proofErr w:type="spellStart"/>
+      <w:r>
+        <w:rPr>
+          <w:sz w:val="24"/>
+          <w:szCs w:val="24"/>
+        </w:rPr>
+        <w:t>Chmod</w:t>
+      </w:r>
+      <w:proofErr w:type="spellEnd"/>
+      <w:r>
+        <w:rPr>
+          <w:sz w:val="24"/>
+          <w:szCs w:val="24"/>
+        </w:rPr>
+        <w:t xml:space="preserve"> 000 archivo.txt</w:t>
+      </w:r>
       <w:r>
         <w:rPr>
           <w:noProof/>
@@ -230,7 +773,7 @@
                     <pic:cNvPicPr preferRelativeResize="0"/>
                   </pic:nvPicPr>
                   <pic:blipFill>
-                    <a:blip r:embed="rId7"/>
+                    <a:blip r:embed="rId9"/>
                     <a:srcRect/>
                     <a:stretch>
                       <a:fillRect/>
@@ -255,10 +798,123 @@
     </w:p>
     <w:p>
       <w:pPr>
-        <w:numPr>
-          <w:ilvl w:val="0"/>
-          <w:numId w:val="2"/>
-        </w:numPr>
+        <w:jc w:val="both"/>
+        <w:rPr>
+          <w:i/>
+          <w:iCs/>
+          <w:sz w:val="24"/>
+          <w:szCs w:val="24"/>
+        </w:rPr>
+      </w:pPr>
+      <w:r>
+        <w:rPr>
+          <w:i/>
+          <w:iCs/>
+          <w:sz w:val="24"/>
+          <w:szCs w:val="24"/>
+        </w:rPr>
+        <w:t xml:space="preserve">Imagen </w:t>
+      </w:r>
+      <w:r>
+        <w:rPr>
+          <w:i/>
+          <w:iCs/>
+          <w:sz w:val="24"/>
+          <w:szCs w:val="24"/>
+        </w:rPr>
+        <w:t>5</w:t>
+      </w:r>
+      <w:r>
+        <w:rPr>
+          <w:i/>
+          <w:iCs/>
+          <w:sz w:val="24"/>
+          <w:szCs w:val="24"/>
+        </w:rPr>
+        <w:t xml:space="preserve">. Evidencia del compañero de equipo Alejandro </w:t>
+      </w:r>
+      <w:r>
+        <w:rPr>
+          <w:i/>
+          <w:iCs/>
+          <w:sz w:val="24"/>
+          <w:szCs w:val="24"/>
+        </w:rPr>
+        <w:t xml:space="preserve">creando el archivo, quitándole permisos </w:t>
+      </w:r>
+      <w:proofErr w:type="spellStart"/>
+      <w:r>
+        <w:rPr>
+          <w:i/>
+          <w:iCs/>
+          <w:sz w:val="24"/>
+          <w:szCs w:val="24"/>
+        </w:rPr>
+        <w:t>chmod</w:t>
+      </w:r>
+      <w:proofErr w:type="spellEnd"/>
+      <w:r>
+        <w:rPr>
+          <w:i/>
+          <w:iCs/>
+          <w:sz w:val="24"/>
+          <w:szCs w:val="24"/>
+        </w:rPr>
+        <w:t xml:space="preserve"> 000. </w:t>
+      </w:r>
+    </w:p>
+    <w:p>
+      <w:pPr>
+        <w:jc w:val="both"/>
+        <w:rPr>
+          <w:i/>
+          <w:iCs/>
+          <w:sz w:val="24"/>
+          <w:szCs w:val="24"/>
+        </w:rPr>
+      </w:pPr>
+    </w:p>
+    <w:p>
+      <w:pPr>
+        <w:rPr>
+          <w:sz w:val="24"/>
+          <w:szCs w:val="24"/>
+        </w:rPr>
+      </w:pPr>
+      <w:r>
+        <w:rPr>
+          <w:sz w:val="24"/>
+          <w:szCs w:val="24"/>
+        </w:rPr>
+        <w:t xml:space="preserve">En esta captura el compañero Alejandro </w:t>
+      </w:r>
+      <w:r>
+        <w:rPr>
+          <w:sz w:val="24"/>
+          <w:szCs w:val="24"/>
+        </w:rPr>
+        <w:t xml:space="preserve">confirma los cambios mediante el comando </w:t>
+      </w:r>
+      <w:proofErr w:type="spellStart"/>
+      <w:r>
+        <w:rPr>
+          <w:sz w:val="24"/>
+          <w:szCs w:val="24"/>
+        </w:rPr>
+        <w:t>ls</w:t>
+      </w:r>
+      <w:proofErr w:type="spellEnd"/>
+      <w:r>
+        <w:rPr>
+          <w:sz w:val="24"/>
+          <w:szCs w:val="24"/>
+        </w:rPr>
+        <w:t xml:space="preserve"> -l</w:t>
+      </w:r>
+    </w:p>
+    <w:p>
+      <w:pPr>
+        <w:jc w:val="both"/>
         <w:rPr>
           <w:sz w:val="24"/>
           <w:szCs w:val="24"/>
@@ -270,7 +926,6 @@
           <w:sz w:val="24"/>
           <w:szCs w:val="24"/>
         </w:rPr>
-        <w:lastRenderedPageBreak/>
         <w:drawing>
           <wp:inline distT="114300" distB="114300" distL="114300" distR="114300" wp14:anchorId="609B587F" wp14:editId="429EFC71">
             <wp:extent cx="5731200" cy="1689100"/>
@@ -285,7 +940,7 @@
                     <pic:cNvPicPr preferRelativeResize="0"/>
                   </pic:nvPicPr>
                   <pic:blipFill>
-                    <a:blip r:embed="rId8"/>
+                    <a:blip r:embed="rId10"/>
                     <a:srcRect/>
                     <a:stretch>
                       <a:fillRect/>
@@ -310,10 +965,128 @@
     </w:p>
     <w:p>
       <w:pPr>
-        <w:numPr>
-          <w:ilvl w:val="0"/>
-          <w:numId w:val="2"/>
-        </w:numPr>
+        <w:jc w:val="both"/>
+        <w:rPr>
+          <w:i/>
+          <w:iCs/>
+          <w:sz w:val="24"/>
+          <w:szCs w:val="24"/>
+        </w:rPr>
+      </w:pPr>
+      <w:r>
+        <w:rPr>
+          <w:i/>
+          <w:iCs/>
+          <w:sz w:val="24"/>
+          <w:szCs w:val="24"/>
+        </w:rPr>
+        <w:t xml:space="preserve">Imagen </w:t>
+      </w:r>
+      <w:r>
+        <w:rPr>
+          <w:i/>
+          <w:iCs/>
+          <w:sz w:val="24"/>
+          <w:szCs w:val="24"/>
+        </w:rPr>
+        <w:t>6</w:t>
+      </w:r>
+      <w:r>
+        <w:rPr>
+          <w:i/>
+          <w:iCs/>
+          <w:sz w:val="24"/>
+          <w:szCs w:val="24"/>
+        </w:rPr>
+        <w:t xml:space="preserve">. Evidencia del compañero de equipo Alejandro </w:t>
+      </w:r>
+      <w:r>
+        <w:rPr>
+          <w:i/>
+          <w:iCs/>
+          <w:sz w:val="24"/>
+          <w:szCs w:val="24"/>
+        </w:rPr>
+        <w:t>confirmando el cambio de permisos</w:t>
+      </w:r>
+    </w:p>
+    <w:p>
+      <w:pPr>
+        <w:jc w:val="both"/>
+        <w:rPr>
+          <w:i/>
+          <w:iCs/>
+          <w:sz w:val="24"/>
+          <w:szCs w:val="24"/>
+        </w:rPr>
+      </w:pPr>
+      <w:r>
+        <w:rPr>
+          <w:i/>
+          <w:iCs/>
+          <w:sz w:val="24"/>
+          <w:szCs w:val="24"/>
+        </w:rPr>
+        <w:t xml:space="preserve">. </w:t>
+      </w:r>
+    </w:p>
+    <w:p>
+      <w:pPr>
+        <w:rPr>
+          <w:sz w:val="24"/>
+          <w:szCs w:val="24"/>
+        </w:rPr>
+      </w:pPr>
+      <w:r>
+        <w:rPr>
+          <w:sz w:val="24"/>
+          <w:szCs w:val="24"/>
+        </w:rPr>
+        <w:t xml:space="preserve">En esta captura el compañero Alejandro </w:t>
+      </w:r>
+      <w:r>
+        <w:rPr>
+          <w:sz w:val="24"/>
+          <w:szCs w:val="24"/>
+        </w:rPr>
+        <w:t xml:space="preserve">otorgando permisos mediante </w:t>
+      </w:r>
+      <w:proofErr w:type="spellStart"/>
+      <w:r>
+        <w:rPr>
+          <w:sz w:val="24"/>
+          <w:szCs w:val="24"/>
+        </w:rPr>
+        <w:t>chmod</w:t>
+      </w:r>
+      <w:proofErr w:type="spellEnd"/>
+      <w:r>
+        <w:rPr>
+          <w:sz w:val="24"/>
+          <w:szCs w:val="24"/>
+        </w:rPr>
+        <w:t xml:space="preserve"> </w:t>
+      </w:r>
+      <w:proofErr w:type="spellStart"/>
+      <w:r>
+        <w:rPr>
+          <w:sz w:val="24"/>
+          <w:szCs w:val="24"/>
+        </w:rPr>
+        <w:t>u+w</w:t>
+      </w:r>
+      <w:proofErr w:type="spellEnd"/>
+      <w:r>
+        <w:rPr>
+          <w:sz w:val="24"/>
+          <w:szCs w:val="24"/>
+        </w:rPr>
+        <w:t xml:space="preserve"> archivo.txt</w:t>
+      </w:r>
+    </w:p>
+    <w:p>
+      <w:pPr>
+        <w:jc w:val="both"/>
         <w:rPr>
           <w:sz w:val="24"/>
           <w:szCs w:val="24"/>
@@ -339,7 +1112,7 @@
                     <pic:cNvPicPr preferRelativeResize="0"/>
                   </pic:nvPicPr>
                   <pic:blipFill>
-                    <a:blip r:embed="rId9"/>
+                    <a:blip r:embed="rId11"/>
                     <a:srcRect/>
                     <a:stretch>
                       <a:fillRect/>
@@ -364,10 +1137,73 @@
     </w:p>
     <w:p>
       <w:pPr>
-        <w:numPr>
-          <w:ilvl w:val="0"/>
-          <w:numId w:val="2"/>
-        </w:numPr>
+        <w:jc w:val="both"/>
+        <w:rPr>
+          <w:i/>
+          <w:iCs/>
+          <w:sz w:val="24"/>
+          <w:szCs w:val="24"/>
+        </w:rPr>
+      </w:pPr>
+      <w:r>
+        <w:rPr>
+          <w:i/>
+          <w:iCs/>
+          <w:sz w:val="24"/>
+          <w:szCs w:val="24"/>
+        </w:rPr>
+        <w:t xml:space="preserve">Imagen </w:t>
+      </w:r>
+      <w:r>
+        <w:rPr>
+          <w:i/>
+          <w:iCs/>
+          <w:sz w:val="24"/>
+          <w:szCs w:val="24"/>
+        </w:rPr>
+        <w:t>7</w:t>
+      </w:r>
+      <w:r>
+        <w:rPr>
+          <w:i/>
+          <w:iCs/>
+          <w:sz w:val="24"/>
+          <w:szCs w:val="24"/>
+        </w:rPr>
+        <w:t xml:space="preserve">. Evidencia del compañero de equipo Alejandro confirmando </w:t>
+      </w:r>
+      <w:r>
+        <w:rPr>
+          <w:i/>
+          <w:iCs/>
+          <w:sz w:val="24"/>
+          <w:szCs w:val="24"/>
+        </w:rPr>
+        <w:t>el otorgamiento de permisos.</w:t>
+      </w:r>
+    </w:p>
+    <w:p>
+      <w:pPr>
+        <w:jc w:val="both"/>
+        <w:rPr>
+          <w:i/>
+          <w:iCs/>
+          <w:sz w:val="24"/>
+          <w:szCs w:val="24"/>
+        </w:rPr>
+      </w:pPr>
+    </w:p>
+    <w:p>
+      <w:pPr>
+        <w:jc w:val="both"/>
+        <w:rPr>
+          <w:sz w:val="24"/>
+          <w:szCs w:val="24"/>
+        </w:rPr>
+      </w:pPr>
+    </w:p>
+    <w:p>
+      <w:pPr>
         <w:rPr>
           <w:sz w:val="24"/>
           <w:szCs w:val="24"/>
@@ -379,6 +1215,7 @@
           <w:sz w:val="24"/>
           <w:szCs w:val="24"/>
         </w:rPr>
+        <w:lastRenderedPageBreak/>
         <w:drawing>
           <wp:inline distT="114300" distB="114300" distL="114300" distR="114300" wp14:anchorId="0BC0EAC2" wp14:editId="02FAD78B">
             <wp:extent cx="5731200" cy="5168900"/>
@@ -393,7 +1230,7 @@
                     <pic:cNvPicPr preferRelativeResize="0"/>
                   </pic:nvPicPr>
                   <pic:blipFill>
-                    <a:blip r:embed="rId10"/>
+                    <a:blip r:embed="rId12"/>
                     <a:srcRect/>
                     <a:stretch>
                       <a:fillRect/>
@@ -414,6 +1251,51 @@
             </a:graphic>
           </wp:inline>
         </w:drawing>
+      </w:r>
+    </w:p>
+    <w:p>
+      <w:pPr>
+        <w:jc w:val="both"/>
+        <w:rPr>
+          <w:sz w:val="24"/>
+          <w:szCs w:val="24"/>
+        </w:rPr>
+      </w:pPr>
+      <w:r>
+        <w:rPr>
+          <w:i/>
+          <w:iCs/>
+          <w:sz w:val="24"/>
+          <w:szCs w:val="24"/>
+        </w:rPr>
+        <w:t xml:space="preserve">Imagen </w:t>
+      </w:r>
+      <w:r>
+        <w:rPr>
+          <w:i/>
+          <w:iCs/>
+          <w:sz w:val="24"/>
+          <w:szCs w:val="24"/>
+        </w:rPr>
+        <w:t>7</w:t>
+      </w:r>
+      <w:r>
+        <w:rPr>
+          <w:i/>
+          <w:iCs/>
+          <w:sz w:val="24"/>
+          <w:szCs w:val="24"/>
+        </w:rPr>
+        <w:t xml:space="preserve">. Evidencia del </w:t>
+      </w:r>
+      <w:r>
+        <w:rPr>
+          <w:i/>
+          <w:iCs/>
+          <w:sz w:val="24"/>
+          <w:szCs w:val="24"/>
+        </w:rPr>
+        <w:t>ticket levantado para la resolución del cambio de permisos.</w:t>
       </w:r>
     </w:p>
     <w:sectPr>
@@ -1179,7 +2061,6 @@
   <w:style w:type="character" w:default="1" w:styleId="Fuentedeprrafopredeter">
     <w:name w:val="Default Paragraph Font"/>
     <w:uiPriority w:val="1"/>
-    <w:semiHidden/>
     <w:unhideWhenUsed/>
   </w:style>
   <w:style w:type="table" w:default="1" w:styleId="Tablanormal">

</xml_diff>